<commit_message>
Apply report review: loss, promotion rule, statistics, tests, Windows setup
- Explain the policy-loss implementation exactly (log-probabilities into
  log_softmax) and correct the L2 coefficient: weight decay 1e-4 is
  c = 5e-5 in the loss, half the paper's value.
- Distinguish the paper's promotion rule (> 55% of 400 games) from ours
  (>= 55% of 20-40 games); iteration 7 would not pass the paper's rule.
- Replace "statistically clear" with the binomial test for iteration 9
  and its independence caveat.
- Describe the project as a scaled-down version of AlphaGo Zero.
- Test count: 101 tests, all passing; 2 need httpx. Add Windows steps.
- Remove the uncited Medium reference.
- Bring the slides' notes, scripts, explanations and
  Final_Training_Report.md in line; drop the unverified iteration 1-2
  results from Final_Training_Report.md.
</commit_message>
<xml_diff>
--- a/Final_Submission/AlphaGoZero_Final_Report.docx
+++ b/Final_Submission/AlphaGoZero_Final_Report.docx
@@ -735,7 +735,7 @@
           <w:sz w:val="28"/>
           <w:szCs w:val="28"/>
         </w:rPr>
-        <w:t xml:space="preserve">12</w:t>
+        <w:t xml:space="preserve">13</w:t>
       </w:r>
     </w:p>
     <w:p>
@@ -766,7 +766,7 @@
           <w:sz w:val="28"/>
           <w:szCs w:val="28"/>
         </w:rPr>
-        <w:t xml:space="preserve">16</w:t>
+        <w:t xml:space="preserve">17</w:t>
       </w:r>
     </w:p>
     <w:p>
@@ -797,7 +797,7 @@
           <w:sz w:val="28"/>
           <w:szCs w:val="28"/>
         </w:rPr>
-        <w:t xml:space="preserve">17</w:t>
+        <w:t xml:space="preserve">18</w:t>
       </w:r>
     </w:p>
     <w:p>
@@ -828,7 +828,7 @@
           <w:sz w:val="28"/>
           <w:szCs w:val="28"/>
         </w:rPr>
-        <w:t xml:space="preserve">18</w:t>
+        <w:t xml:space="preserve">19</w:t>
       </w:r>
     </w:p>
     <w:p>
@@ -865,7 +865,7 @@
           <w:sz w:val="28"/>
           <w:szCs w:val="28"/>
         </w:rPr>
-        <w:t xml:space="preserve">19</w:t>
+        <w:t xml:space="preserve">20</w:t>
       </w:r>
     </w:p>
     <w:p>
@@ -975,7 +975,25 @@
           <w:sz w:val="24"/>
           <w:szCs w:val="24"/>
         </w:rPr>
-        <w:t xml:space="preserve">In this project we studied the paper and implemented the complete AlphaGo Zero training loop in Python and PyTorch [10] on a 12×12 board, scaled down to run on a single laptop. Our contributions are:</w:t>
+        <w:t xml:space="preserve">In this project we studied the paper and implemented a </w:t>
+      </w:r>
+      <w:r>
+        <w:rPr>
+          <w:rFonts w:ascii="Times New Roman" w:hAnsi="Times New Roman" w:cs="Times New Roman"/>
+          <w:b/>
+          <w:bCs/>
+          <w:sz w:val="24"/>
+          <w:szCs w:val="24"/>
+        </w:rPr>
+        <w:t xml:space="preserve">scaled-down version of AlphaGo Zero</w:t>
+      </w:r>
+      <w:r>
+        <w:rPr>
+          <w:rFonts w:ascii="Times New Roman" w:hAnsi="Times New Roman" w:cs="Times New Roman"/>
+          <w:sz w:val="24"/>
+          <w:szCs w:val="24"/>
+        </w:rPr>
+        <w:t xml:space="preserve"> in Python and PyTorch [10]. It keeps the algorithm's structure (self-play with MCTS, a dual-head network and gated evaluation) but uses a 12×12 board, a much smaller network and search budget, and far fewer games, so that it runs on a single laptop. It is therefore not a reproduction of the paper's results. Our contributions are:</w:t>
       </w:r>
     </w:p>
     <w:p>
@@ -2246,7 +2264,7 @@
                 <w:sz w:val="21"/>
                 <w:szCs w:val="21"/>
               </w:rPr>
-              <w:t xml:space="preserve">Gated, 55% of 400 games</w:t>
+              <w:t xml:space="preserve">Gated: &gt; 55% of 400 games</w:t>
             </w:r>
           </w:p>
         </w:tc>
@@ -2284,7 +2302,7 @@
                 <w:sz w:val="21"/>
                 <w:szCs w:val="21"/>
               </w:rPr>
-              <w:t xml:space="preserve">Gated, 55% of 20–40 games</w:t>
+              <w:t xml:space="preserve">Gated: ≥ 55% of 20–40 games</w:t>
             </w:r>
           </w:p>
         </w:tc>
@@ -3674,7 +3692,7 @@
           <w:sz w:val="24"/>
           <w:szCs w:val="24"/>
         </w:rPr>
-        <w:t xml:space="preserve">The L2 term is applied as weight decay, c = 10⁻⁴. We use SGD with momentum 0.9, a learning rate of 0.001 and mini-batches of 32 positions, for 4 to 8 epochs per iteration depending on the stage. Each candidate starts from the weights of the current best model, and a checkpoint is saved after every epoch. Because </w:t>
+        <w:t xml:space="preserve">Both data terms are averaged over each mini-batch. We use SGD with momentum 0.9, a learning rate of 0.001 and mini-batches of 32 positions, for 4 to 8 epochs per iteration depending on the stage. Each candidate starts from the weights of the current best model, and a checkpoint is saved after every epoch. The implementation is </w:t>
       </w:r>
       <w:r>
         <w:rPr>
@@ -3682,6 +3700,102 @@
           <w:sz w:val="22"/>
           <w:szCs w:val="22"/>
         </w:rPr>
+        <w:t xml:space="preserve">Trainer.calculate_loss</w:t>
+      </w:r>
+      <w:r>
+        <w:rPr>
+          <w:rFonts w:ascii="Times New Roman" w:hAnsi="Times New Roman" w:cs="Times New Roman"/>
+          <w:sz w:val="24"/>
+          <w:szCs w:val="24"/>
+        </w:rPr>
+        <w:t xml:space="preserve"> and </w:t>
+      </w:r>
+      <w:r>
+        <w:rPr>
+          <w:rFonts w:ascii="Courier New" w:hAnsi="Courier New" w:cs="Courier New"/>
+          <w:sz w:val="22"/>
+          <w:szCs w:val="22"/>
+        </w:rPr>
+        <w:t xml:space="preserve">Trainer.train_epoch</w:t>
+      </w:r>
+      <w:r>
+        <w:rPr>
+          <w:rFonts w:ascii="Times New Roman" w:hAnsi="Times New Roman" w:cs="Times New Roman"/>
+          <w:sz w:val="24"/>
+          <w:szCs w:val="24"/>
+        </w:rPr>
+        <w:t xml:space="preserve"> in </w:t>
+      </w:r>
+      <w:r>
+        <w:rPr>
+          <w:rFonts w:ascii="Courier New" w:hAnsi="Courier New" w:cs="Courier New"/>
+          <w:sz w:val="22"/>
+          <w:szCs w:val="22"/>
+        </w:rPr>
+        <w:t xml:space="preserve">training/trainer.py</w:t>
+      </w:r>
+      <w:r>
+        <w:rPr>
+          <w:rFonts w:ascii="Times New Roman" w:hAnsi="Times New Roman" w:cs="Times New Roman"/>
+          <w:sz w:val="24"/>
+          <w:szCs w:val="24"/>
+        </w:rPr>
+        <w:t xml:space="preserve">.</w:t>
+      </w:r>
+    </w:p>
+    <w:p>
+      <w:pPr>
+        <w:spacing w:before="0" w:after="120" w:line="360" w:lineRule="auto"/>
+        <w:jc w:val="both"/>
+      </w:pPr>
+      <w:r>
+        <w:rPr>
+          <w:rFonts w:ascii="Times New Roman" w:hAnsi="Times New Roman" w:cs="Times New Roman"/>
+          <w:b/>
+          <w:bCs/>
+          <w:sz w:val="24"/>
+          <w:szCs w:val="24"/>
+        </w:rPr>
+        <w:t xml:space="preserve">L2 term.</w:t>
+      </w:r>
+      <w:r>
+        <w:rPr>
+          <w:rFonts w:ascii="Times New Roman" w:hAnsi="Times New Roman" w:cs="Times New Roman"/>
+          <w:sz w:val="24"/>
+          <w:szCs w:val="24"/>
+        </w:rPr>
+        <w:t xml:space="preserve"> The regulariser is not written into the loss; it is applied through the optimiser's weight decay λ = 10⁻⁴. With SGD, weight decay adds λθ to the gradient, which is the gradient of (λ/2)‖θ‖². Our setting therefore corresponds to c = λ/2 = 5×10⁻⁵ in the formula above, half of the paper's c = 10⁻⁴.</w:t>
+      </w:r>
+    </w:p>
+    <w:p>
+      <w:pPr>
+        <w:spacing w:before="0" w:after="120" w:line="360" w:lineRule="auto"/>
+        <w:jc w:val="both"/>
+      </w:pPr>
+      <w:r>
+        <w:rPr>
+          <w:rFonts w:ascii="Times New Roman" w:hAnsi="Times New Roman" w:cs="Times New Roman"/>
+          <w:b/>
+          <w:bCs/>
+          <w:sz w:val="24"/>
+          <w:szCs w:val="24"/>
+        </w:rPr>
+        <w:t xml:space="preserve">Policy term.</w:t>
+      </w:r>
+      <w:r>
+        <w:rPr>
+          <w:rFonts w:ascii="Times New Roman" w:hAnsi="Times New Roman" w:cs="Times New Roman"/>
+          <w:sz w:val="24"/>
+          <w:szCs w:val="24"/>
+        </w:rPr>
+        <w:t xml:space="preserve"> </w:t>
+      </w:r>
+      <w:r>
+        <w:rPr>
+          <w:rFonts w:ascii="Courier New" w:hAnsi="Courier New" w:cs="Courier New"/>
+          <w:sz w:val="22"/>
+          <w:szCs w:val="22"/>
+        </w:rPr>
         <w:t xml:space="preserve">GoNetwork</w:t>
       </w:r>
       <w:r>
@@ -3690,7 +3804,47 @@
           <w:sz w:val="24"/>
           <w:szCs w:val="24"/>
         </w:rPr>
-        <w:t xml:space="preserve"> already outputs probabilities, the trainer passes their logarithm to the loss. Applying a second softmax would distort the policy gradient (Section 5.12).</w:t>
+        <w:t xml:space="preserve"> ends with a softmax, so its policy output p is already a probability distribution. The loss function computes −mean over the batch of Σ_a π(a)·log_softmax(x)_a for its policy input x, and the trainer passes x = log p, with p clamped at 10⁻⁸ to avoid log 0. Because the probabilities sum to one, log_softmax(log p) = log p − log Σ_b p_b = log p, so the computed policy loss is the cross-entropy −Σ_a π(a) log p(a) of the formula, except for moves whose probability is below the clamp. Passing p itself, as our first version did, would apply a second softmax and compute a different, flatter distribution (Section 5.12).</w:t>
+      </w:r>
+    </w:p>
+    <w:p>
+      <w:pPr>
+        <w:spacing w:before="0" w:after="120" w:line="360" w:lineRule="auto"/>
+        <w:jc w:val="both"/>
+      </w:pPr>
+      <w:r>
+        <w:rPr>
+          <w:rFonts w:ascii="Times New Roman" w:hAnsi="Times New Roman" w:cs="Times New Roman"/>
+          <w:b/>
+          <w:bCs/>
+          <w:sz w:val="24"/>
+          <w:szCs w:val="24"/>
+        </w:rPr>
+        <w:t xml:space="preserve">Value term.</w:t>
+      </w:r>
+      <w:r>
+        <w:rPr>
+          <w:rFonts w:ascii="Times New Roman" w:hAnsi="Times New Roman" w:cs="Times New Roman"/>
+          <w:sz w:val="24"/>
+          <w:szCs w:val="24"/>
+        </w:rPr>
+        <w:t xml:space="preserve"> The value loss is the mean squared error between the network's v and the game result z over the mini-batch (</w:t>
+      </w:r>
+      <w:r>
+        <w:rPr>
+          <w:rFonts w:ascii="Courier New" w:hAnsi="Courier New" w:cs="Courier New"/>
+          <w:sz w:val="22"/>
+          <w:szCs w:val="22"/>
+        </w:rPr>
+        <w:t xml:space="preserve">F.mse_loss</w:t>
+      </w:r>
+      <w:r>
+        <w:rPr>
+          <w:rFonts w:ascii="Times New Roman" w:hAnsi="Times New Roman" w:cs="Times New Roman"/>
+          <w:sz w:val="24"/>
+          <w:szCs w:val="24"/>
+        </w:rPr>
+        <w:t xml:space="preserve">).</w:t>
       </w:r>
     </w:p>
     <w:p>
@@ -3719,7 +3873,75 @@
           <w:sz w:val="24"/>
           <w:szCs w:val="24"/>
         </w:rPr>
-        <w:t xml:space="preserve">A candidate plays the current best model in an arena match. Colours alternate between games. The first 8 moves of each game are sampled from the visit counts so that games differ, and games are capped at 500 moves and scored by area. Iterations 3–7 used 20 games; from iteration 8 we raised this to 40 games. The candidate is promoted if it wins at least 55%.</w:t>
+        <w:t xml:space="preserve">A candidate plays the current best model in an arena match. Colours alternate between games. The first 8 moves of each game are sampled from the visit counts so that games differ, and games are capped at 500 moves and scored by area. Iterations 3–7 used 20 games; from iteration 8 we raised this to 40 games. The win rate is wins divided by games played, so draws count against the candidate, and the candidate is promoted if its win rate is </w:t>
+      </w:r>
+      <w:r>
+        <w:rPr>
+          <w:rFonts w:ascii="Times New Roman" w:hAnsi="Times New Roman" w:cs="Times New Roman"/>
+          <w:b/>
+          <w:bCs/>
+          <w:sz w:val="24"/>
+          <w:szCs w:val="24"/>
+        </w:rPr>
+        <w:t xml:space="preserve">at least 55%</w:t>
+      </w:r>
+      <w:r>
+        <w:rPr>
+          <w:rFonts w:ascii="Times New Roman" w:hAnsi="Times New Roman" w:cs="Times New Roman"/>
+          <w:sz w:val="24"/>
+          <w:szCs w:val="24"/>
+        </w:rPr>
+        <w:t xml:space="preserve">.</w:t>
+      </w:r>
+    </w:p>
+    <w:p>
+      <w:pPr>
+        <w:spacing w:before="0" w:after="120" w:line="360" w:lineRule="auto"/>
+        <w:jc w:val="both"/>
+      </w:pPr>
+      <w:r>
+        <w:rPr>
+          <w:rFonts w:ascii="Times New Roman" w:hAnsi="Times New Roman" w:cs="Times New Roman"/>
+          <w:sz w:val="24"/>
+          <w:szCs w:val="24"/>
+        </w:rPr>
+        <w:t xml:space="preserve">This criterion is looser than the paper's in two ways. The paper promotes a candidate only if it wins </w:t>
+      </w:r>
+      <w:r>
+        <w:rPr>
+          <w:rFonts w:ascii="Times New Roman" w:hAnsi="Times New Roman" w:cs="Times New Roman"/>
+          <w:b/>
+          <w:bCs/>
+          <w:sz w:val="24"/>
+          <w:szCs w:val="24"/>
+        </w:rPr>
+        <w:t xml:space="preserve">more than 55%</w:t>
+      </w:r>
+      <w:r>
+        <w:rPr>
+          <w:rFonts w:ascii="Times New Roman" w:hAnsi="Times New Roman" w:cs="Times New Roman"/>
+          <w:sz w:val="24"/>
+          <w:szCs w:val="24"/>
+        </w:rPr>
+        <w:t xml:space="preserve"> of </w:t>
+      </w:r>
+      <w:r>
+        <w:rPr>
+          <w:rFonts w:ascii="Times New Roman" w:hAnsi="Times New Roman" w:cs="Times New Roman"/>
+          <w:b/>
+          <w:bCs/>
+          <w:sz w:val="24"/>
+          <w:szCs w:val="24"/>
+        </w:rPr>
+        <w:t xml:space="preserve">400</w:t>
+      </w:r>
+      <w:r>
+        <w:rPr>
+          <w:rFonts w:ascii="Times New Roman" w:hAnsi="Times New Roman" w:cs="Times New Roman"/>
+          <w:sz w:val="24"/>
+          <w:szCs w:val="24"/>
+        </w:rPr>
+        <w:t xml:space="preserve"> games [1]; we use at least 55% of 20 or 40 games. The difference mattered once: iteration 7 was promoted with exactly 55% (11 of 20 games), which the paper's strict threshold would have rejected. With 20 games, an equally strong model reaches 11 wins about 41% of the time, so this promotion on its own was weak evidence. That is why we moved to 40 games from iteration 8.</w:t>
       </w:r>
     </w:p>
     <w:p>
@@ -4454,7 +4676,7 @@
           <w:sz w:val="24"/>
           <w:szCs w:val="24"/>
         </w:rPr>
-        <w:t xml:space="preserve">Table 4 lists the main differences. Most are reductions in scale forced by running on one laptop instead of a large cluster; the algorithm itself is unchanged.</w:t>
+        <w:t xml:space="preserve">Table 4 lists the main differences. Most are reductions in scale forced by running on one laptop instead of a large cluster. A few are simplifications: fewer input features, simpler rules, sequential rather than asynchronous iterations, and a looser promotion threshold. The structure of the algorithm is the same, so our system is best described as a scaled-down AlphaGo Zero, and its results should not be compared directly with the paper's.</w:t>
       </w:r>
     </w:p>
     <w:p>
@@ -5051,7 +5273,7 @@
                 <w:sz w:val="21"/>
                 <w:szCs w:val="21"/>
               </w:rPr>
-              <w:t xml:space="preserve">400 games, 55%</w:t>
+              <w:t xml:space="preserve">400 games; promote if &gt; 55%</w:t>
             </w:r>
           </w:p>
         </w:tc>
@@ -5070,7 +5292,7 @@
                 <w:sz w:val="21"/>
                 <w:szCs w:val="21"/>
               </w:rPr>
-              <w:t xml:space="preserve">20–40 games, 55%</w:t>
+              <w:t xml:space="preserve">20–40 games; promote if ≥ 55%</w:t>
             </w:r>
           </w:p>
         </w:tc>
@@ -5430,7 +5652,25 @@
           <w:sz w:val="24"/>
           <w:szCs w:val="24"/>
         </w:rPr>
-        <w:t xml:space="preserve">Training ran from 6 to 10 October 2026 on a laptop with a 20-thread CPU (18 self-play workers), 15 GB of RAM and an NVIDIA GeForce RTX 4050 Laptop GPU (6 GB), using Python 3.14, PyTorch 2.11 and CUDA 12.8. Iterations 3–9 ran on Windows; iteration 10 ran mostly on Linux. The code base has 99 passing unit tests covering the environment, network shapes, MCTS, self-play, training and evaluation; two further web-server tests require the </w:t>
+        <w:t xml:space="preserve">Training ran from 6 to 10 October 2026 on a laptop with a 20-thread CPU (18 self-play workers), 15 GB of RAM and an NVIDIA GeForce RTX 4050 Laptop GPU (6 GB), using Python 3.14, PyTorch 2.11 and CUDA 12.8. Iterations 3–9 ran on Windows; iteration 10 ran mostly on Linux. The code base has </w:t>
+      </w:r>
+      <w:r>
+        <w:rPr>
+          <w:rFonts w:ascii="Times New Roman" w:hAnsi="Times New Roman" w:cs="Times New Roman"/>
+          <w:b/>
+          <w:bCs/>
+          <w:sz w:val="24"/>
+          <w:szCs w:val="24"/>
+        </w:rPr>
+        <w:t xml:space="preserve">101 unit tests</w:t>
+      </w:r>
+      <w:r>
+        <w:rPr>
+          <w:rFonts w:ascii="Times New Roman" w:hAnsi="Times New Roman" w:cs="Times New Roman"/>
+          <w:sz w:val="24"/>
+          <w:szCs w:val="24"/>
+        </w:rPr>
+        <w:t xml:space="preserve">, covering the environment, network shapes, MCTS, self-play, training, evaluation and the web server, and all 101 pass. Two of them (</w:t>
       </w:r>
       <w:r>
         <w:rPr>
@@ -5438,6 +5678,22 @@
           <w:sz w:val="22"/>
           <w:szCs w:val="22"/>
         </w:rPr>
+        <w:t xml:space="preserve">tests/test_web_sgf_heatmap.py</w:t>
+      </w:r>
+      <w:r>
+        <w:rPr>
+          <w:rFonts w:ascii="Times New Roman" w:hAnsi="Times New Roman" w:cs="Times New Roman"/>
+          <w:sz w:val="24"/>
+          <w:szCs w:val="24"/>
+        </w:rPr>
+        <w:t xml:space="preserve">) need the </w:t>
+      </w:r>
+      <w:r>
+        <w:rPr>
+          <w:rFonts w:ascii="Courier New" w:hAnsi="Courier New" w:cs="Courier New"/>
+          <w:sz w:val="22"/>
+          <w:szCs w:val="22"/>
+        </w:rPr>
         <w:t xml:space="preserve">httpx</w:t>
       </w:r>
       <w:r>
@@ -5446,7 +5702,23 @@
           <w:sz w:val="24"/>
           <w:szCs w:val="24"/>
         </w:rPr>
-        <w:t xml:space="preserve"> package.</w:t>
+        <w:t xml:space="preserve"> package, which is not listed in </w:t>
+      </w:r>
+      <w:r>
+        <w:rPr>
+          <w:rFonts w:ascii="Courier New" w:hAnsi="Courier New" w:cs="Courier New"/>
+          <w:sz w:val="22"/>
+          <w:szCs w:val="22"/>
+        </w:rPr>
+        <w:t xml:space="preserve">requirements.txt</w:t>
+      </w:r>
+      <w:r>
+        <w:rPr>
+          <w:rFonts w:ascii="Times New Roman" w:hAnsi="Times New Roman" w:cs="Times New Roman"/>
+          <w:sz w:val="24"/>
+          <w:szCs w:val="24"/>
+        </w:rPr>
+        <w:t xml:space="preserve">; without it pytest stops while collecting that file, and the other 99 tests pass when it is skipped.</w:t>
       </w:r>
     </w:p>
     <w:p>
@@ -9387,7 +9659,21 @@
           <w:sz w:val="24"/>
           <w:szCs w:val="24"/>
         </w:rPr>
-        <w:t xml:space="preserve"> Three promotions show that the self-play loop produced stronger networks with no human data, as the paper claims. Iteration 9's result is statistically clear: if both models were equally strong, the standard error of a 40-game win rate would be √(0.25/40) ≈ 7.9 percentage points, so 72.5% is about 2.8 standard errors above 50%.</w:t>
+        <w:t xml:space="preserve"> Three promotions show that the self-play loop produced stronger networks without human data, consistent with the paper's central claim. Iteration 9's result is the strongest evidence: if iterations 9 and 7 were equally strong, winning 29 or more of 40 games would happen with probability about 0.003 (one-sided binomial test; about 0.006 two-sided).</w:t>
+      </w:r>
+    </w:p>
+    <w:p>
+      <w:pPr>
+        <w:spacing w:before="0" w:after="120" w:line="360" w:lineRule="auto"/>
+        <w:jc w:val="both"/>
+      </w:pPr>
+      <w:r>
+        <w:rPr>
+          <w:rFonts w:ascii="Times New Roman" w:hAnsi="Times New Roman" w:cs="Times New Roman"/>
+          <w:sz w:val="24"/>
+          <w:szCs w:val="24"/>
+        </w:rPr>
+        <w:t xml:space="preserve">This figure should be read with care. The test assumes that games are independent, which holds only approximately: every game is between the same two models and games differ mainly through the 8 sampled opening moves. It also compares iteration 9 only with iteration 7. We therefore treat it as strong evidence that iteration 9 is stronger than iteration 7 under our evaluation conditions, not as an exact significance level or a measure of absolute strength.</w:t>
       </w:r>
     </w:p>
     <w:p>
@@ -9506,7 +9792,7 @@
           <w:sz w:val="24"/>
           <w:szCs w:val="24"/>
         </w:rPr>
-        <w:t xml:space="preserve"> [1] and implemented its complete method: a Go environment, a dual-head residual network, PUCT-based MCTS with Dirichlet noise and temperature, parallel self-play, training with the AlphaGo Zero loss, and gated evaluation. Trained from scratch on a laptop through a four-stage curriculum, the system produced three promoted models. The best, iteration 9, won 72.5% of its games against its predecessor, and the policy loss fell from 4.78 to 3.24.</w:t>
+        <w:t xml:space="preserve"> [1] and implemented a scaled-down version of its method: a Go environment, a dual-head residual network, PUCT-based MCTS with Dirichlet noise and temperature, parallel self-play, training with the AlphaGo Zero loss, and gated evaluation. Trained from scratch on a laptop through a four-stage curriculum, the system produced three promoted models. The best, iteration 9, won 72.5% of its games against its predecessor, and the policy loss fell from 4.78 to 3.24.</w:t>
       </w:r>
     </w:p>
     <w:p>
@@ -10187,50 +10473,6 @@
           <w:szCs w:val="24"/>
         </w:rPr>
         <w:t xml:space="preserve">, 2019, pp. 8024–8035.</w:t>
-      </w:r>
-    </w:p>
-    <w:p>
-      <w:pPr>
-        <w:spacing w:after="120" w:line="300" w:lineRule="auto"/>
-        <w:ind w:left="567" w:hanging="567"/>
-        <w:jc w:val="left"/>
-      </w:pPr>
-      <w:r>
-        <w:rPr>
-          <w:rFonts w:ascii="Times New Roman" w:hAnsi="Times New Roman" w:cs="Times New Roman"/>
-          <w:sz w:val="24"/>
-          <w:szCs w:val="24"/>
-        </w:rPr>
-        <w:t xml:space="preserve">[11]</w:t>
-      </w:r>
-      <w:r>
-        <w:tab/>
-      </w:r>
-      <w:r>
-        <w:rPr>
-          <w:rFonts w:ascii="Times New Roman" w:hAnsi="Times New Roman" w:cs="Times New Roman"/>
-          <w:sz w:val="24"/>
-          <w:szCs w:val="24"/>
-        </w:rPr>
-        <w:t xml:space="preserve">D. Foster, “AlphaGo Zero explained in one diagram,” </w:t>
-      </w:r>
-      <w:r>
-        <w:rPr>
-          <w:rFonts w:ascii="Times New Roman" w:hAnsi="Times New Roman" w:cs="Times New Roman"/>
-          <w:i/>
-          <w:iCs/>
-          <w:sz w:val="24"/>
-          <w:szCs w:val="24"/>
-        </w:rPr>
-        <w:t xml:space="preserve">Applied Data Science</w:t>
-      </w:r>
-      <w:r>
-        <w:rPr>
-          <w:rFonts w:ascii="Times New Roman" w:hAnsi="Times New Roman" w:cs="Times New Roman"/>
-          <w:sz w:val="24"/>
-          <w:szCs w:val="24"/>
-        </w:rPr>
-        <w:t xml:space="preserve"> (Medium), 2017. [Online]. Available: https://medium.com/applied-data-science/alphago-zero-explained-in-one-diagram-365f5abf67e0</w:t>
       </w:r>
     </w:p>
     <w:p>
@@ -10865,6 +11107,88 @@
     </w:p>
     <w:p>
       <w:pPr>
+        <w:spacing w:before="0" w:after="120" w:line="360" w:lineRule="auto"/>
+        <w:jc w:val="both"/>
+      </w:pPr>
+      <w:r>
+        <w:rPr>
+          <w:rFonts w:ascii="Times New Roman" w:hAnsi="Times New Roman" w:cs="Times New Roman"/>
+          <w:sz w:val="24"/>
+          <w:szCs w:val="24"/>
+        </w:rPr>
+        <w:t xml:space="preserve">For GPU training, first install the CUDA build of PyTorch for your system from pytorch.org; </w:t>
+      </w:r>
+      <w:r>
+        <w:rPr>
+          <w:rFonts w:ascii="Courier New" w:hAnsi="Courier New" w:cs="Courier New"/>
+          <w:sz w:val="22"/>
+          <w:szCs w:val="22"/>
+        </w:rPr>
+        <w:t xml:space="preserve">requirements.txt</w:t>
+      </w:r>
+      <w:r>
+        <w:rPr>
+          <w:rFonts w:ascii="Times New Roman" w:hAnsi="Times New Roman" w:cs="Times New Roman"/>
+          <w:sz w:val="24"/>
+          <w:szCs w:val="24"/>
+        </w:rPr>
+        <w:t xml:space="preserve"> alone may install a CPU-only build. Git LFS must be installed to download the models. </w:t>
+      </w:r>
+      <w:r>
+        <w:rPr>
+          <w:rFonts w:ascii="Courier New" w:hAnsi="Courier New" w:cs="Courier New"/>
+          <w:sz w:val="22"/>
+          <w:szCs w:val="22"/>
+        </w:rPr>
+        <w:t xml:space="preserve">pytest</w:t>
+      </w:r>
+      <w:r>
+        <w:rPr>
+          <w:rFonts w:ascii="Times New Roman" w:hAnsi="Times New Roman" w:cs="Times New Roman"/>
+          <w:sz w:val="24"/>
+          <w:szCs w:val="24"/>
+        </w:rPr>
+        <w:t xml:space="preserve"> and </w:t>
+      </w:r>
+      <w:r>
+        <w:rPr>
+          <w:rFonts w:ascii="Courier New" w:hAnsi="Courier New" w:cs="Courier New"/>
+          <w:sz w:val="22"/>
+          <w:szCs w:val="22"/>
+        </w:rPr>
+        <w:t xml:space="preserve">httpx</w:t>
+      </w:r>
+      <w:r>
+        <w:rPr>
+          <w:rFonts w:ascii="Times New Roman" w:hAnsi="Times New Roman" w:cs="Times New Roman"/>
+          <w:sz w:val="24"/>
+          <w:szCs w:val="24"/>
+        </w:rPr>
+        <w:t xml:space="preserve"> are needed only for the tests.</w:t>
+      </w:r>
+    </w:p>
+    <w:p>
+      <w:pPr>
+        <w:keepNext/>
+        <w:keepLines/>
+        <w:spacing w:before="0" w:after="120" w:line="360" w:lineRule="auto"/>
+        <w:jc w:val="both"/>
+      </w:pPr>
+      <w:r>
+        <w:rPr>
+          <w:rFonts w:ascii="Times New Roman" w:hAnsi="Times New Roman" w:cs="Times New Roman"/>
+          <w:b/>
+          <w:bCs/>
+          <w:sz w:val="24"/>
+          <w:szCs w:val="24"/>
+        </w:rPr>
+        <w:t xml:space="preserve">Linux or macOS:</w:t>
+      </w:r>
+    </w:p>
+    <w:p>
+      <w:pPr>
+        <w:keepNext/>
+        <w:keepLines/>
         <w:shd w:val="clear" w:color="auto" w:fill="F2F4F7"/>
         <w:spacing w:after="0" w:line="264" w:lineRule="auto"/>
         <w:ind w:left="284"/>
@@ -10880,6 +11204,8 @@
     </w:p>
     <w:p>
       <w:pPr>
+        <w:keepNext/>
+        <w:keepLines/>
         <w:shd w:val="clear" w:color="auto" w:fill="F2F4F7"/>
         <w:spacing w:after="0" w:line="264" w:lineRule="auto"/>
         <w:ind w:left="284"/>
@@ -10895,6 +11221,8 @@
     </w:p>
     <w:p>
       <w:pPr>
+        <w:keepNext/>
+        <w:keepLines/>
         <w:shd w:val="clear" w:color="auto" w:fill="F2F4F7"/>
         <w:spacing w:after="0" w:line="264" w:lineRule="auto"/>
         <w:ind w:left="284"/>
@@ -10905,11 +11233,13 @@
           <w:sz w:val="19"/>
           <w:szCs w:val="19"/>
         </w:rPr>
-        <w:t xml:space="preserve">git lfs pull                      # download the trained models</w:t>
-      </w:r>
-    </w:p>
-    <w:p>
-      <w:pPr>
+        <w:t xml:space="preserve">git lfs install &amp;&amp; git lfs pull   # download the trained models</w:t>
+      </w:r>
+    </w:p>
+    <w:p>
+      <w:pPr>
+        <w:keepNext/>
+        <w:keepLines/>
         <w:shd w:val="clear" w:color="auto" w:fill="F2F4F7"/>
         <w:spacing w:after="0" w:line="264" w:lineRule="auto"/>
         <w:ind w:left="284"/>
@@ -10920,11 +11250,13 @@
           <w:sz w:val="19"/>
           <w:szCs w:val="19"/>
         </w:rPr>
-        <w:t xml:space="preserve">python -m venv .venv &amp;&amp; source .venv/bin/activate</w:t>
-      </w:r>
-    </w:p>
-    <w:p>
-      <w:pPr>
+        <w:t xml:space="preserve">python3 -m venv .venv &amp;&amp; source .venv/bin/activate</w:t>
+      </w:r>
+    </w:p>
+    <w:p>
+      <w:pPr>
+        <w:keepNext/>
+        <w:keepLines/>
         <w:shd w:val="clear" w:color="auto" w:fill="F2F4F7"/>
         <w:spacing w:after="0" w:line="264" w:lineRule="auto"/>
         <w:ind w:left="284"/>
@@ -10940,6 +11272,7 @@
     </w:p>
     <w:p>
       <w:pPr>
+        <w:keepLines/>
         <w:shd w:val="clear" w:color="auto" w:fill="F2F4F7"/>
         <w:spacing w:after="160" w:line="264" w:lineRule="auto"/>
         <w:ind w:left="284"/>
@@ -10950,11 +11283,13 @@
           <w:sz w:val="19"/>
           <w:szCs w:val="19"/>
         </w:rPr>
-        <w:t xml:space="preserve">pytest                            # run the test suite</w:t>
-      </w:r>
-    </w:p>
-    <w:p>
-      <w:pPr>
+        <w:t xml:space="preserve">pytest                            # 101 tests</w:t>
+      </w:r>
+    </w:p>
+    <w:p>
+      <w:pPr>
+        <w:keepNext/>
+        <w:keepLines/>
         <w:spacing w:before="0" w:after="120" w:line="360" w:lineRule="auto"/>
         <w:jc w:val="both"/>
       </w:pPr>
@@ -10966,19 +11301,53 @@
           <w:sz w:val="24"/>
           <w:szCs w:val="24"/>
         </w:rPr>
-        <w:t xml:space="preserve">Reproducing training.</w:t>
-      </w:r>
-      <w:r>
-        <w:rPr>
-          <w:rFonts w:ascii="Times New Roman" w:hAnsi="Times New Roman" w:cs="Times New Roman"/>
-          <w:sz w:val="24"/>
-          <w:szCs w:val="24"/>
-        </w:rPr>
-        <w:t xml:space="preserve"> Each stage trains its two iterations in turn. Self-play is saved every 25 games, so the same command resumes an interrupted run.</w:t>
-      </w:r>
-    </w:p>
-    <w:p>
-      <w:pPr>
+        <w:t xml:space="preserve">Windows (PowerShell).</w:t>
+      </w:r>
+      <w:r>
+        <w:rPr>
+          <w:rFonts w:ascii="Times New Roman" w:hAnsi="Times New Roman" w:cs="Times New Roman"/>
+          <w:sz w:val="24"/>
+          <w:szCs w:val="24"/>
+        </w:rPr>
+        <w:t xml:space="preserve"> Iterations 3–9 were trained on Windows with these steps. If PowerShell refuses to run </w:t>
+      </w:r>
+      <w:r>
+        <w:rPr>
+          <w:rFonts w:ascii="Courier New" w:hAnsi="Courier New" w:cs="Courier New"/>
+          <w:sz w:val="22"/>
+          <w:szCs w:val="22"/>
+        </w:rPr>
+        <w:t xml:space="preserve">Activate.ps1</w:t>
+      </w:r>
+      <w:r>
+        <w:rPr>
+          <w:rFonts w:ascii="Times New Roman" w:hAnsi="Times New Roman" w:cs="Times New Roman"/>
+          <w:sz w:val="24"/>
+          <w:szCs w:val="24"/>
+        </w:rPr>
+        <w:t xml:space="preserve">, first run </w:t>
+      </w:r>
+      <w:r>
+        <w:rPr>
+          <w:rFonts w:ascii="Courier New" w:hAnsi="Courier New" w:cs="Courier New"/>
+          <w:sz w:val="22"/>
+          <w:szCs w:val="22"/>
+        </w:rPr>
+        <w:t xml:space="preserve">Set-ExecutionPolicy -Scope CurrentUser RemoteSigned</w:t>
+      </w:r>
+      <w:r>
+        <w:rPr>
+          <w:rFonts w:ascii="Times New Roman" w:hAnsi="Times New Roman" w:cs="Times New Roman"/>
+          <w:sz w:val="24"/>
+          <w:szCs w:val="24"/>
+        </w:rPr>
+        <w:t xml:space="preserve">.</w:t>
+      </w:r>
+    </w:p>
+    <w:p>
+      <w:pPr>
+        <w:keepNext/>
+        <w:keepLines/>
         <w:shd w:val="clear" w:color="auto" w:fill="F2F4F7"/>
         <w:spacing w:after="0" w:line="264" w:lineRule="auto"/>
         <w:ind w:left="284"/>
@@ -10989,11 +11358,13 @@
           <w:sz w:val="19"/>
           <w:szCs w:val="19"/>
         </w:rPr>
-        <w:t xml:space="preserve">python train_batched.py --stage 2     # iterations 3-4</w:t>
-      </w:r>
-    </w:p>
-    <w:p>
-      <w:pPr>
+        <w:t xml:space="preserve">git clone https://github.com/chandrakanth-source/ALPHAGo-Zero.git</w:t>
+      </w:r>
+    </w:p>
+    <w:p>
+      <w:pPr>
+        <w:keepNext/>
+        <w:keepLines/>
         <w:shd w:val="clear" w:color="auto" w:fill="F2F4F7"/>
         <w:spacing w:after="0" w:line="264" w:lineRule="auto"/>
         <w:ind w:left="284"/>
@@ -11004,11 +11375,186 @@
           <w:sz w:val="19"/>
           <w:szCs w:val="19"/>
         </w:rPr>
+        <w:t xml:space="preserve">cd ALPHAGo-Zero; git checkout shafreed</w:t>
+      </w:r>
+    </w:p>
+    <w:p>
+      <w:pPr>
+        <w:keepNext/>
+        <w:keepLines/>
+        <w:shd w:val="clear" w:color="auto" w:fill="F2F4F7"/>
+        <w:spacing w:after="0" w:line="264" w:lineRule="auto"/>
+        <w:ind w:left="284"/>
+      </w:pPr>
+      <w:r>
+        <w:rPr>
+          <w:rFonts w:ascii="Courier New" w:hAnsi="Courier New" w:cs="Courier New"/>
+          <w:sz w:val="19"/>
+          <w:szCs w:val="19"/>
+        </w:rPr>
+        <w:t xml:space="preserve">git lfs install; git lfs pull</w:t>
+      </w:r>
+    </w:p>
+    <w:p>
+      <w:pPr>
+        <w:keepNext/>
+        <w:keepLines/>
+        <w:shd w:val="clear" w:color="auto" w:fill="F2F4F7"/>
+        <w:spacing w:after="0" w:line="264" w:lineRule="auto"/>
+        <w:ind w:left="284"/>
+      </w:pPr>
+      <w:r>
+        <w:rPr>
+          <w:rFonts w:ascii="Courier New" w:hAnsi="Courier New" w:cs="Courier New"/>
+          <w:sz w:val="19"/>
+          <w:szCs w:val="19"/>
+        </w:rPr>
+        <w:t xml:space="preserve">py -m venv .venv</w:t>
+      </w:r>
+    </w:p>
+    <w:p>
+      <w:pPr>
+        <w:keepNext/>
+        <w:keepLines/>
+        <w:shd w:val="clear" w:color="auto" w:fill="F2F4F7"/>
+        <w:spacing w:after="0" w:line="264" w:lineRule="auto"/>
+        <w:ind w:left="284"/>
+      </w:pPr>
+      <w:r>
+        <w:rPr>
+          <w:rFonts w:ascii="Courier New" w:hAnsi="Courier New" w:cs="Courier New"/>
+          <w:sz w:val="19"/>
+          <w:szCs w:val="19"/>
+        </w:rPr>
+        <w:t xml:space="preserve">.venv\Scripts\Activate.ps1</w:t>
+      </w:r>
+    </w:p>
+    <w:p>
+      <w:pPr>
+        <w:keepNext/>
+        <w:keepLines/>
+        <w:shd w:val="clear" w:color="auto" w:fill="F2F4F7"/>
+        <w:spacing w:after="0" w:line="264" w:lineRule="auto"/>
+        <w:ind w:left="284"/>
+      </w:pPr>
+      <w:r>
+        <w:rPr>
+          <w:rFonts w:ascii="Courier New" w:hAnsi="Courier New" w:cs="Courier New"/>
+          <w:sz w:val="19"/>
+          <w:szCs w:val="19"/>
+        </w:rPr>
+        <w:t xml:space="preserve">pip install -r requirements.txt pytest httpx</w:t>
+      </w:r>
+    </w:p>
+    <w:p>
+      <w:pPr>
+        <w:keepLines/>
+        <w:shd w:val="clear" w:color="auto" w:fill="F2F4F7"/>
+        <w:spacing w:after="160" w:line="264" w:lineRule="auto"/>
+        <w:ind w:left="284"/>
+      </w:pPr>
+      <w:r>
+        <w:rPr>
+          <w:rFonts w:ascii="Courier New" w:hAnsi="Courier New" w:cs="Courier New"/>
+          <w:sz w:val="19"/>
+          <w:szCs w:val="19"/>
+        </w:rPr>
+        <w:t xml:space="preserve">pytest</w:t>
+      </w:r>
+    </w:p>
+    <w:p>
+      <w:pPr>
+        <w:spacing w:before="0" w:after="120" w:line="360" w:lineRule="auto"/>
+        <w:jc w:val="both"/>
+      </w:pPr>
+      <w:r>
+        <w:rPr>
+          <w:rFonts w:ascii="Times New Roman" w:hAnsi="Times New Roman" w:cs="Times New Roman"/>
+          <w:b/>
+          <w:bCs/>
+          <w:sz w:val="24"/>
+          <w:szCs w:val="24"/>
+        </w:rPr>
+        <w:t xml:space="preserve">Reproducing training.</w:t>
+      </w:r>
+      <w:r>
+        <w:rPr>
+          <w:rFonts w:ascii="Times New Roman" w:hAnsi="Times New Roman" w:cs="Times New Roman"/>
+          <w:sz w:val="24"/>
+          <w:szCs w:val="24"/>
+        </w:rPr>
+        <w:t xml:space="preserve"> Each stage trains its two iterations in turn. Self-play is saved every 25 games, so the same command resumes an interrupted run. The commands are the same on every system (on Windows, </w:t>
+      </w:r>
+      <w:r>
+        <w:rPr>
+          <w:rFonts w:ascii="Courier New" w:hAnsi="Courier New" w:cs="Courier New"/>
+          <w:sz w:val="22"/>
+          <w:szCs w:val="22"/>
+        </w:rPr>
+        <w:t xml:space="preserve">python</w:t>
+      </w:r>
+      <w:r>
+        <w:rPr>
+          <w:rFonts w:ascii="Times New Roman" w:hAnsi="Times New Roman" w:cs="Times New Roman"/>
+          <w:sz w:val="24"/>
+          <w:szCs w:val="24"/>
+        </w:rPr>
+        <w:t xml:space="preserve"> runs the interpreter from the activated </w:t>
+      </w:r>
+      <w:r>
+        <w:rPr>
+          <w:rFonts w:ascii="Courier New" w:hAnsi="Courier New" w:cs="Courier New"/>
+          <w:sz w:val="22"/>
+          <w:szCs w:val="22"/>
+        </w:rPr>
+        <w:t xml:space="preserve">.venv</w:t>
+      </w:r>
+      <w:r>
+        <w:rPr>
+          <w:rFonts w:ascii="Times New Roman" w:hAnsi="Times New Roman" w:cs="Times New Roman"/>
+          <w:sz w:val="24"/>
+          <w:szCs w:val="24"/>
+        </w:rPr>
+        <w:t xml:space="preserve">).</w:t>
+      </w:r>
+    </w:p>
+    <w:p>
+      <w:pPr>
+        <w:keepNext/>
+        <w:keepLines/>
+        <w:shd w:val="clear" w:color="auto" w:fill="F2F4F7"/>
+        <w:spacing w:after="0" w:line="264" w:lineRule="auto"/>
+        <w:ind w:left="284"/>
+      </w:pPr>
+      <w:r>
+        <w:rPr>
+          <w:rFonts w:ascii="Courier New" w:hAnsi="Courier New" w:cs="Courier New"/>
+          <w:sz w:val="19"/>
+          <w:szCs w:val="19"/>
+        </w:rPr>
+        <w:t xml:space="preserve">python train_batched.py --stage 2     # iterations 3-4</w:t>
+      </w:r>
+    </w:p>
+    <w:p>
+      <w:pPr>
+        <w:keepNext/>
+        <w:keepLines/>
+        <w:shd w:val="clear" w:color="auto" w:fill="F2F4F7"/>
+        <w:spacing w:after="0" w:line="264" w:lineRule="auto"/>
+        <w:ind w:left="284"/>
+      </w:pPr>
+      <w:r>
+        <w:rPr>
+          <w:rFonts w:ascii="Courier New" w:hAnsi="Courier New" w:cs="Courier New"/>
+          <w:sz w:val="19"/>
+          <w:szCs w:val="19"/>
+        </w:rPr>
         <w:t xml:space="preserve">python train_batched.py --stage 5     # iterations 9-10</w:t>
       </w:r>
     </w:p>
     <w:p>
       <w:pPr>
+        <w:keepLines/>
         <w:shd w:val="clear" w:color="auto" w:fill="F2F4F7"/>
         <w:spacing w:after="160" w:line="264" w:lineRule="auto"/>
         <w:ind w:left="284"/>

</xml_diff>